<commit_message>
Document Get Receipt by Bill ID + gst_percentage/service_charge_percentage
Full 200-request live regression against production passes.
</commit_message>
<xml_diff>
--- a/docs/DineOS_New_APIs_Tracker.docx
+++ b/docs/DineOS_New_APIs_Tracker.docx
@@ -1706,12 +1706,95 @@
     </w:tbl>
     <w:p/>
     <w:p>
+      <w:pPr>
+        <w:pStyle w:val="Heading2"/>
+      </w:pPr>
+      <w:r>
+        <w:rPr>
+          <w:sz w:val="24"/>
+        </w:rPr>
+        <w:t>2026-08-19 — Get Receipt by Bill ID</w:t>
+      </w:r>
+    </w:p>
+    <w:tbl>
+      <w:tblPr>
+        <w:tblStyle w:val="LightGrid-Accent1"/>
+        <w:tblW w:type="auto" w:w="0"/>
+        <w:tblLook w:firstColumn="1" w:firstRow="1" w:lastColumn="0" w:lastRow="0" w:noHBand="0" w:noVBand="1" w:val="04A0"/>
+      </w:tblPr>
+      <w:tblGrid>
+        <w:gridCol w:w="4320"/>
+        <w:gridCol w:w="4320"/>
+      </w:tblGrid>
+      <w:tr>
+        <w:tc>
+          <w:tcPr>
+            <w:tcW w:type="dxa" w:w="4320"/>
+          </w:tcPr>
+          <w:p>
+            <w:r>
+              <w:rPr>
+                <w:b/>
+                <w:sz w:val="18"/>
+              </w:rPr>
+              <w:t>Method</w:t>
+            </w:r>
+          </w:p>
+        </w:tc>
+        <w:tc>
+          <w:tcPr>
+            <w:tcW w:type="dxa" w:w="4320"/>
+          </w:tcPr>
+          <w:p>
+            <w:r>
+              <w:rPr>
+                <w:b/>
+                <w:sz w:val="18"/>
+              </w:rPr>
+              <w:t>Endpoint</w:t>
+            </w:r>
+          </w:p>
+        </w:tc>
+      </w:tr>
+      <w:tr>
+        <w:tc>
+          <w:tcPr>
+            <w:tcW w:type="dxa" w:w="4320"/>
+          </w:tcPr>
+          <w:p>
+            <w:r>
+              <w:rPr>
+                <w:rFonts w:ascii="Calibri" w:hAnsi="Calibri"/>
+                <w:sz w:val="17"/>
+              </w:rPr>
+              <w:t>GET</w:t>
+            </w:r>
+          </w:p>
+        </w:tc>
+        <w:tc>
+          <w:tcPr>
+            <w:tcW w:type="dxa" w:w="4320"/>
+          </w:tcPr>
+          <w:p>
+            <w:r>
+              <w:rPr>
+                <w:rFonts w:ascii="Consolas" w:hAnsi="Consolas"/>
+                <w:sz w:val="17"/>
+              </w:rPr>
+              <w:t>/v1/bills/{bill_id}/</w:t>
+            </w:r>
+          </w:p>
+        </w:tc>
+      </w:tr>
+    </w:tbl>
+    <w:p/>
+    <w:p>
       <w:r>
         <w:rPr>
           <w:i/>
           <w:sz w:val="18"/>
         </w:rPr>
-        <w:t>Note: ViewSet-registered resources (marked with “+”) expand to their standard list/create/retrieve/update/destroy routes — see the main API doc (DineOS_Backend_API_Documentation.docx) for the exact per-action breakdown and live-verified examples of every route. Everything built from 2026-08-17 onward (staff/purchase-order filters, dashboard fields, notification triggers, server assignment, cashier discrepancy reason, receipt data, branch filters, activity log filters) added new fields/filters to these already-existing endpoints rather than new URLs, so isn't a new row here — see the main doc's dated Notes for those.</w:t>
+        <w:t>Note: ViewSet-registered resources (marked with “+”) expand to their standard list/create/retrieve/update/destroy routes — see the main API doc (DineOS_Backend_API_Documentation.docx) for the exact per-action breakdown and live-verified examples of every route. Most work between 2026-08-17 and 2026-08-19 (staff/purchase-order filters, dashboard fields, notification triggers, server assignment, cashier discrepancy reason, receipt fields, branch filters, activity log filters) added new fields/filters to already-existing endpoints rather than new URLs, so isn’t listed here — see the main doc’s dated Notes for those. Get Receipt by Bill ID (above) is the one genuine new URL from that window.</w:t>
       </w:r>
     </w:p>
     <w:sectPr>

</xml_diff>